<commit_message>
DPIA: open registration closed and test accounts deleted (reported 7 October 2026)
Co-Authored-By: Claude Sonnet 5.5 <noreply@anthropic.com>
</commit_message>
<xml_diff>
--- a/public/governance/dpia-draft.docx
+++ b/public/governance/dpia-draft.docx
@@ -6754,7 +6754,7 @@
                 <w:sz w:val="19"/>
                 <w:szCs w:val="19"/>
               </w:rPr>
-              <w:t xml:space="preserve">NEW: the Firebase project allowed anyone with the public key to register an account when last checked (2 October 2026); such an account could read data not protected by a specific permission</w:t>
+              <w:t xml:space="preserve">NEW: the Firebase project allowed anyone with the public key to register an account (found 2 October 2026); such an account could read data not protected by a specific permission. Registration has since been switched off (reported by the administrator, 7 October 2026)</w:t>
             </w:r>
           </w:p>
         </w:tc>
@@ -6783,7 +6783,7 @@
                 <w:sz w:val="19"/>
                 <w:szCs w:val="19"/>
               </w:rPr>
-              <w:t xml:space="preserve">Possible</w:t>
+              <w:t xml:space="preserve">Possible (while open)</w:t>
             </w:r>
           </w:p>
         </w:tc>
@@ -6841,7 +6841,7 @@
                 <w:sz w:val="19"/>
                 <w:szCs w:val="19"/>
               </w:rPr>
-              <w:t xml:space="preserve">Medium until closed</w:t>
+              <w:t xml:space="preserve">Low now closed</w:t>
             </w:r>
           </w:p>
         </w:tc>
@@ -8970,7 +8970,7 @@
                 <w:sz w:val="19"/>
                 <w:szCs w:val="19"/>
               </w:rPr>
-              <w:t xml:space="preserve">The app never registers accounts from the sign-in screen; accounts are created by a server function. Registration should be switched off in the Firebase console (Authentication settings). Not confirmed as done.</w:t>
+              <w:t xml:space="preserve">The app never registers accounts from the sign-in screen; accounts are created by a server function. Registration was switched off in the Firebase console (Authentication settings) on 7 October 2026, as reported by the administrator; the DPO may wish to see the setting for themselves.</w:t>
             </w:r>
           </w:p>
         </w:tc>
@@ -8999,7 +8999,7 @@
                 <w:sz w:val="19"/>
                 <w:szCs w:val="19"/>
               </w:rPr>
-              <w:t xml:space="preserve">Low once closed</w:t>
+              <w:t xml:space="preserve">Low</w:t>
             </w:r>
           </w:p>
         </w:tc>
@@ -10706,7 +10706,7 @@
                 <w:sz w:val="19"/>
                 <w:szCs w:val="19"/>
               </w:rPr>
-              <w:t xml:space="preserve">Open when last checked (2 October 2026). To be switched off by the administrator; confirm.</w:t>
+              <w:t xml:space="preserve">Closed on 7 October 2026 (reported by the administrator). Was open when found on 2 October.</w:t>
             </w:r>
           </w:p>
         </w:tc>
@@ -12871,7 +12871,7 @@
                 <w:sz w:val="19"/>
                 <w:szCs w:val="19"/>
               </w:rPr>
-              <w:t xml:space="preserve">Switch off open account registration in Firebase Authentication; delete the four test accounts created on 2 October 2026 with fictitious example.com addresses, if not already done (no personal data involved; record per the practice's incident process).</w:t>
+              <w:t xml:space="preserve">Done 7 October 2026 (reported by the administrator): open account registration switched off and the four test accounts created on 2 October 2026 (fictitious example.com addresses, no personal data) deleted. Record the episode in the practice's incident log if its policy requires.</w:t>
             </w:r>
           </w:p>
         </w:tc>

</xml_diff>

<commit_message>
Pulse orb on the desktop: its own always-on-top window when Primovex is minimised or closed to the tray
On the Windows app, a small transparent orb window appears on the desktop while the main window is minimised or hidden, pulsing faster on a substantial change, draggable (position remembered), with double-click or the tray icon bringing Primovex back. The close button can hide Primovex to the system tray instead of quitting (tray menu: Open, Quit). Both are on by default per person, can be switched off in the Pulse settings, only act while signed in, and signing out quits as normal. The orb window holds no app data; it is told a score and a line of text. DPIA updated.

Co-Authored-By: Claude Sonnet 5.5 <noreply@anthropic.com>
</commit_message>
<xml_diff>
--- a/public/governance/dpia-draft.docx
+++ b/public/governance/dpia-draft.docx
@@ -1542,6 +1542,70 @@
                 <w:szCs w:val="19"/>
               </w:rPr>
               <w:t xml:space="preserve">The staff list and chart are visible only to System Admins and roles granted user-management permission. Other staff see only a name and role where they must choose a colleague (for example to assign a SAR).</w:t>
+            </w:r>
+          </w:p>
+        </w:tc>
+      </w:tr>
+      <w:tr>
+        <w:trPr>
+          <w:cantSplit/>
+        </w:trPr>
+        <w:tc>
+          <w:tcPr>
+            <w:tcW w:type="dxa" w:w="2200"/>
+            <w:tcBorders>
+              <w:top w:val="single" w:color="BFB9A8" w:sz="4"/>
+              <w:left w:val="single" w:color="BFB9A8" w:sz="4"/>
+              <w:bottom w:val="single" w:color="BFB9A8" w:sz="4"/>
+              <w:right w:val="single" w:color="BFB9A8" w:sz="4"/>
+            </w:tcBorders>
+            <w:shd w:fill="F6F5F1" w:color="auto" w:val="clear"/>
+            <w:tcMar>
+              <w:top w:type="dxa" w:w="70"/>
+              <w:left w:type="dxa" w:w="110"/>
+              <w:bottom w:type="dxa" w:w="70"/>
+              <w:right w:type="dxa" w:w="110"/>
+            </w:tcMar>
+          </w:tcPr>
+          <w:p>
+            <w:pPr>
+              <w:spacing w:after="40"/>
+            </w:pPr>
+            <w:r>
+              <w:rPr>
+                <w:sz w:val="19"/>
+                <w:szCs w:val="19"/>
+              </w:rPr>
+              <w:t xml:space="preserve">Desktop orb and tray (Windows)</w:t>
+            </w:r>
+          </w:p>
+        </w:tc>
+        <w:tc>
+          <w:tcPr>
+            <w:tcW w:type="dxa" w:w="7438"/>
+            <w:tcBorders>
+              <w:top w:val="single" w:color="BFB9A8" w:sz="4"/>
+              <w:left w:val="single" w:color="BFB9A8" w:sz="4"/>
+              <w:bottom w:val="single" w:color="BFB9A8" w:sz="4"/>
+              <w:right w:val="single" w:color="BFB9A8" w:sz="4"/>
+            </w:tcBorders>
+            <w:tcMar>
+              <w:top w:type="dxa" w:w="70"/>
+              <w:left w:type="dxa" w:w="110"/>
+              <w:bottom w:type="dxa" w:w="70"/>
+              <w:right w:type="dxa" w:w="110"/>
+            </w:tcMar>
+          </w:tcPr>
+          <w:p>
+            <w:pPr>
+              <w:spacing w:after="40"/>
+            </w:pPr>
+            <w:r>
+              <w:rPr>
+                <w:sz w:val="19"/>
+                <w:szCs w:val="19"/>
+              </w:rPr>
+              <w:t xml:space="preserve">On the Windows desktop app, closing the window can hide Primovex to the system tray instead of quitting, and a small always-on-top Pulse orb shows on the desktop while the window is minimised or hidden. The orb shows only a score and a one-line status such as a count of items. While Primovex runs in the tray the person stays signed in; the 15-minute lock and 12-hour session limit still apply. Each person can switch both off in the Pulse settings, and signing out quits as normal. Shared computers should be locked or signed out at the end of a shift under the practice's usual policy.</w:t>
             </w:r>
           </w:p>
         </w:tc>

</xml_diff>

<commit_message>
Orb stock: where is it / how many, message a team, raise a reorder (each confirmed on a card before anything happens)
Understands 'tell the HCA team BD blue needles need ordering', 'BD blue needles need ordering'
and 'what's in anaphylaxis box 3'. Items, places and teams are resolved against real data and
ambiguity is asked about. Team messages go through the orbTeamMessage callable (stock write,
rate limited, refuses identifiers, audited); reorders use the existing Reorder Centre request.
DPIA v0.2 text, Orb data-flow doc and help articles updated.

Co-Authored-By: Claude Sonnet 5.5 <noreply@anthropic.com>
</commit_message>
<xml_diff>
--- a/public/governance/dpia-draft.docx
+++ b/public/governance/dpia-draft.docx
@@ -2382,7 +2382,7 @@
         <w:spacing w:after="100" w:line="276"/>
       </w:pPr>
       <w:r>
-        <w:t xml:space="preserve">The Orb is Primovex's assistant. It answers questions about the practice (stock, fridges, cleaning, alerts and similar) from approved, read-only lookups. Until recently it understood only fixed phrases. Two optional AI features now use Microsoft Azure OpenAI. Both are switched off until a System Admin turns each one on, with a confirmation that the region and this DPIA have been checked. They are independent.</w:t>
+        <w:t xml:space="preserve">The Orb is Primovex's assistant. It answers questions about the practice (stock, fridges, cleaning, alerts and similar) from approved lookups, and can now also prepare two actions for a person to confirm: a short message to a team (everyone with a role such as HCA) and a reorder request for a stock item. Nothing is sent or created until the person presses Confirm on a card that shows exactly what will happen; the card expires after 15 minutes, can be used once, and is checked against the person's permissions again. The messages can't contain numbers, dates, email addresses or phone numbers, so patient details are refused, and each use is recorded in the audit trail. Until recently it understood only fixed phrases. Two optional AI features now use Microsoft Azure OpenAI. Both are switched off until a System Admin turns each one on, with a confirmation that the region and this DPIA have been checked. They are independent.</w:t>
       </w:r>
     </w:p>
     <w:tbl>
@@ -3189,7 +3189,7 @@
         <w:spacing w:after="60" w:line="276"/>
       </w:pPr>
       <w:r>
-        <w:t xml:space="preserve">No decision about a person is made by the AI. It only chooses a read-only lookup or rewords an answer. All lookups are read-only; the Orb cannot change any record.</w:t>
+        <w:t xml:space="preserve">No decision about a person is made by the AI. It only chooses a lookup or rewords an answer, and the AI never carries anything out. All lookups only read. The only changes the Orb can make are the two above (a team message, a reorder request), and only after the person presses Confirm.</w:t>
       </w:r>
     </w:p>
     <w:p>
@@ -4367,7 +4367,7 @@
                 <w:sz w:val="19"/>
                 <w:szCs w:val="19"/>
               </w:rPr>
-              <w:t xml:space="preserve">Access is capability-based, enforced at both the application and database layers. The activity report is read-only and cannot be edited by anyone. The proposed purpose limit for activity records is stated above. The AI cannot take actions.</w:t>
+              <w:t xml:space="preserve">Access is capability-based, enforced at both the application and database layers. The activity report is read-only and cannot be edited by anyone. The proposed purpose limit for activity records is stated above. The AI cannot take actions. The Orb's two actions (team message, reorder request) need an explicit Confirm, the same permission as doing it by hand (stock write), and are audited.</w:t>
             </w:r>
           </w:p>
         </w:tc>
@@ -6574,6 +6574,128 @@
                 <w:sz w:val="19"/>
                 <w:szCs w:val="19"/>
               </w:rPr>
+              <w:t xml:space="preserve">NEW: a team message carries patient details, or goes to the wrong people</w:t>
+            </w:r>
+          </w:p>
+        </w:tc>
+        <w:tc>
+          <w:tcPr>
+            <w:tcW w:type="dxa" w:w="1700"/>
+            <w:tcBorders>
+              <w:top w:val="single" w:color="BFB9A8" w:sz="4"/>
+              <w:left w:val="single" w:color="BFB9A8" w:sz="4"/>
+              <w:bottom w:val="single" w:color="BFB9A8" w:sz="4"/>
+              <w:right w:val="single" w:color="BFB9A8" w:sz="4"/>
+            </w:tcBorders>
+            <w:tcMar>
+              <w:top w:type="dxa" w:w="70"/>
+              <w:left w:type="dxa" w:w="110"/>
+              <w:bottom w:type="dxa" w:w="70"/>
+              <w:right w:type="dxa" w:w="110"/>
+            </w:tcMar>
+          </w:tcPr>
+          <w:p>
+            <w:pPr>
+              <w:spacing w:after="40"/>
+            </w:pPr>
+            <w:r>
+              <w:rPr>
+                <w:sz w:val="19"/>
+                <w:szCs w:val="19"/>
+              </w:rPr>
+              <w:t xml:space="preserve">Messages with numbers, dates, email addresses or phone numbers are refused, and the card shows the team and the words before anything is sent. A team means everyone with that role in Primovex, never an outside address. Sending is limited per person per hour and day. Each send is recorded (who, which team, how many people), not the message text.</w:t>
+            </w:r>
+          </w:p>
+        </w:tc>
+        <w:tc>
+          <w:tcPr>
+            <w:tcW w:type="dxa" w:w="1738"/>
+            <w:tcBorders>
+              <w:top w:val="single" w:color="BFB9A8" w:sz="4"/>
+              <w:left w:val="single" w:color="BFB9A8" w:sz="4"/>
+              <w:bottom w:val="single" w:color="BFB9A8" w:sz="4"/>
+              <w:right w:val="single" w:color="BFB9A8" w:sz="4"/>
+            </w:tcBorders>
+            <w:tcMar>
+              <w:top w:type="dxa" w:w="70"/>
+              <w:left w:type="dxa" w:w="110"/>
+              <w:bottom w:type="dxa" w:w="70"/>
+              <w:right w:type="dxa" w:w="110"/>
+            </w:tcMar>
+          </w:tcPr>
+          <w:p>
+            <w:pPr>
+              <w:spacing w:after="40"/>
+            </w:pPr>
+            <w:r>
+              <w:rPr>
+                <w:sz w:val="19"/>
+                <w:szCs w:val="19"/>
+              </w:rPr>
+              <w:t xml:space="preserve">Low</w:t>
+            </w:r>
+          </w:p>
+        </w:tc>
+        <w:tc>
+          <w:tcPr>
+            <w:tcW w:type="dxa" w:w="1300"/>
+            <w:tcBorders>
+              <w:top w:val="single" w:color="BFB9A8" w:sz="4"/>
+              <w:left w:val="single" w:color="BFB9A8" w:sz="4"/>
+              <w:bottom w:val="single" w:color="BFB9A8" w:sz="4"/>
+              <w:right w:val="single" w:color="BFB9A8" w:sz="4"/>
+            </w:tcBorders>
+            <w:tcMar>
+              <w:top w:type="dxa" w:w="70"/>
+              <w:left w:type="dxa" w:w="110"/>
+              <w:bottom w:type="dxa" w:w="70"/>
+              <w:right w:type="dxa" w:w="110"/>
+            </w:tcMar>
+          </w:tcPr>
+          <w:p>
+            <w:pPr>
+              <w:spacing w:after="40"/>
+            </w:pPr>
+            <w:r>
+              <w:rPr>
+                <w:sz w:val="19"/>
+                <w:szCs w:val="19"/>
+              </w:rPr>
+              <w:t xml:space="preserve">☐</w:t>
+            </w:r>
+          </w:p>
+        </w:tc>
+      </w:tr>
+      <w:tr>
+        <w:trPr>
+          <w:cantSplit/>
+        </w:trPr>
+        <w:tc>
+          <w:tcPr>
+            <w:tcW w:type="dxa" w:w="4900"/>
+            <w:tcBorders>
+              <w:top w:val="single" w:color="BFB9A8" w:sz="4"/>
+              <w:left w:val="single" w:color="BFB9A8" w:sz="4"/>
+              <w:bottom w:val="single" w:color="BFB9A8" w:sz="4"/>
+              <w:right w:val="single" w:color="BFB9A8" w:sz="4"/>
+            </w:tcBorders>
+            <w:shd w:fill="F6F5F1" w:color="auto" w:val="clear"/>
+            <w:tcMar>
+              <w:top w:type="dxa" w:w="70"/>
+              <w:left w:type="dxa" w:w="110"/>
+              <w:bottom w:type="dxa" w:w="70"/>
+              <w:right w:type="dxa" w:w="110"/>
+            </w:tcMar>
+          </w:tcPr>
+          <w:p>
+            <w:pPr>
+              <w:spacing w:after="40"/>
+            </w:pPr>
+            <w:r>
+              <w:rPr>
+                <w:sz w:val="19"/>
+                <w:szCs w:val="19"/>
+              </w:rPr>
               <w:t xml:space="preserve">NEW: a malicious question tries to make the AI reveal or do something else (prompt injection)</w:t>
             </w:r>
           </w:p>
@@ -6632,7 +6754,7 @@
                 <w:sz w:val="19"/>
                 <w:szCs w:val="19"/>
               </w:rPr>
-              <w:t xml:space="preserve">Low (it can only name a read-only lookup)</w:t>
+              <w:t xml:space="preserve">Low (it can only name a lookup; it cannot confirm an action)</w:t>
             </w:r>
           </w:p>
         </w:tc>
@@ -8534,7 +8656,7 @@
                 <w:sz w:val="19"/>
                 <w:szCs w:val="19"/>
               </w:rPr>
-              <w:t xml:space="preserve">The AI only chooses among read-only approved lookups the person is already permitted to use, validated on the server. A reworded answer is discarded if it changes a figure or loses a warning, and the original is used. The answer states when the language assistant was involved. Both switches are separate and can be turned off immediately.</w:t>
+              <w:t xml:space="preserve">The AI only chooses among approved lookups the person is already permitted to use, validated on the server. A reworded answer is discarded if it changes a figure or loses a warning, and the original is used. The answer states when the language assistant was involved. Both switches are separate and can be turned off immediately.</w:t>
             </w:r>
           </w:p>
         </w:tc>
@@ -8790,7 +8912,7 @@
                 <w:sz w:val="19"/>
                 <w:szCs w:val="19"/>
               </w:rPr>
-              <w:t xml:space="preserve">The question is treated as untrusted. The AI can only name a lookup from a list restricted to that person's permissions; the server rejects anything else. Lookups are read-only.</w:t>
+              <w:t xml:space="preserve">The question is treated as untrusted. The AI can only name a lookup from a list restricted to that person's permissions; the server rejects anything else. A lookup can only prepare an action; a person has to confirm it.</w:t>
             </w:r>
           </w:p>
         </w:tc>

</xml_diff>

<commit_message>
DPIA: Azure OpenAI region recorded as UK South (stated by the Practice Manager); retention still to confirm
Co-Authored-By: Claude Sonnet 5.5 <noreply@anthropic.com>
</commit_message>
<xml_diff>
--- a/public/governance/dpia-draft.docx
+++ b/public/governance/dpia-draft.docx
@@ -3163,7 +3163,7 @@
         <w:spacing w:after="60" w:line="276"/>
       </w:pPr>
       <w:r>
-        <w:t xml:space="preserve">Processor: Microsoft (Azure OpenAI). The Azure resource is the one already used by ClinFlow. Its region, Microsoft's retention of prompts for abuse monitoring, and the data processing terms are </w:t>
+        <w:t xml:space="preserve">Processor: Microsoft (Azure OpenAI). The Azure resource is the one already used by ClinFlow. Its region is UK South (stated by the Practice Manager on 7 October 2026). Microsoft's retention of prompts for abuse monitoring and the data processing terms are </w:t>
       </w:r>
       <w:r>
         <w:rPr>
@@ -4744,26 +4744,7 @@
                 <w:sz w:val="19"/>
                 <w:szCs w:val="19"/>
               </w:rPr>
-              <w:t xml:space="preserve">Data resides in the EU (eur3); application logic runs in the UK (europe-west2). The Azure OpenAI region is </w:t>
-            </w:r>
-            <w:r>
-              <w:rPr>
-                <w:b/>
-                <w:bCs/>
-                <w:i/>
-                <w:iCs/>
-                <w:color w:val="96631A"/>
-                <w:sz w:val="19"/>
-                <w:szCs w:val="19"/>
-              </w:rPr>
-              <w:t xml:space="preserve">To be completed</w:t>
-            </w:r>
-            <w:r>
-              <w:rPr>
-                <w:sz w:val="19"/>
-                <w:szCs w:val="19"/>
-              </w:rPr>
-              <w:t xml:space="preserve">; if it is outside the UK or EU a transfer assessment is needed.</w:t>
+              <w:t xml:space="preserve">Data resides in the EU (eur3); application logic runs in the UK (europe-west2). The Azure OpenAI resource is in UK South (stated by the Practice Manager on 7 October 2026), so no transfer outside the UK is expected; the region should be checked against the Azure portal when this is signed off.</w:t>
             </w:r>
           </w:p>
         </w:tc>
@@ -6481,7 +6462,7 @@
                 <w:sz w:val="19"/>
                 <w:szCs w:val="19"/>
               </w:rPr>
-              <w:t xml:space="preserve">Unassessed</w:t>
+              <w:t xml:space="preserve">Possible (region stated as UK South, retention not yet confirmed)</w:t>
             </w:r>
           </w:p>
         </w:tc>
@@ -8775,6 +8756,13 @@
             </w:pPr>
             <w:r>
               <w:rPr>
+                <w:sz w:val="19"/>
+                <w:szCs w:val="19"/>
+              </w:rPr>
+              <w:t xml:space="preserve">Region: UK South (stated by the Practice Manager, 7 October 2026; verify in the Azure portal). </w:t>
+            </w:r>
+            <w:r>
+              <w:rPr>
                 <w:b/>
                 <w:bCs/>
                 <w:i/>
@@ -8790,7 +8778,7 @@
                 <w:sz w:val="19"/>
                 <w:szCs w:val="19"/>
               </w:rPr>
-              <w:t xml:space="preserve">: confirm the resource's region (UK South or EU), retention of prompts for abuse monitoring, no training on data, and the data processing terms. Do not turn either AI switch on until confirmed. The administrator is asked to confirm this when turning each on.</w:t>
+              <w:t xml:space="preserve">: confirm retention of prompts for abuse monitoring, no training on data, and the data processing terms. Do not turn either AI switch on until confirmed. The administrator is asked to confirm this when turning each on.</w:t>
             </w:r>
           </w:p>
         </w:tc>
@@ -12592,7 +12580,7 @@
                 <w:sz w:val="19"/>
                 <w:szCs w:val="19"/>
               </w:rPr>
-              <w:t xml:space="preserve">Confirm the Azure OpenAI resource's region (UK South or EU), Microsoft's retention of prompts for abuse monitoring, no training on data, and the data processing terms. Decide whether to approve each AI switch separately.</w:t>
+              <w:t xml:space="preserve">Verify in the Azure portal that the resource is in UK South (stated 7 October 2026), and confirm Microsoft's retention of prompts for abuse monitoring, no training on data, and the data processing terms. Decide whether to approve each AI switch separately.</w:t>
             </w:r>
           </w:p>
         </w:tc>

</xml_diff>

<commit_message>
Significant events (report, triage, investigate, review, meeting minutes, actions), SARs on the phone, spaces without a floor now show in the hierarchy
Anyone can report a significant event on desktop or phone; the Significant events team (new
governance.seTeam permission) runs it; practice-set default reviewer roles, editable per event;
meetings cover several events with minutes and actions; reviewers and action owners get only what
they need. Rules and attack suite (190 passing), notification callable, DPIA and help updated.

Co-Authored-By: Claude Sonnet 5.5 <noreply@anthropic.com>
</commit_message>
<xml_diff>
--- a/public/governance/dpia-draft.docx
+++ b/public/governance/dpia-draft.docx
@@ -511,7 +511,7 @@
                 <w:sz w:val="20"/>
                 <w:szCs w:val="20"/>
               </w:rPr>
-              <w:t xml:space="preserve">Version 0.1 covered Concerns, SARs, Inventory and Temperature. Primovex has since gained four things that process personal data in new ways. Each is described below and has its own risks and measures.</w:t>
+              <w:t xml:space="preserve">Version 0.1 covered Concerns, SARs, Inventory and Temperature. Primovex has since gained four things that process personal data in new ways, and a fifth, Significant events, added on 8 October 2026. Each is described below and has its own risks and measures.</w:t>
             </w:r>
           </w:p>
           <w:p>
@@ -632,7 +632,7 @@
         <w:spacing w:after="60" w:line="276"/>
       </w:pPr>
       <w:r>
-        <w:t xml:space="preserve">Special category data. Concerns and SARs relate to patient care and, even pseudonymised, fall within Article 9 health data by association.</w:t>
+        <w:t xml:space="preserve">Special category data. Concerns, SARs and Significant events relate to patient care and, even pseudonymised, fall within Article 9 health data by association.</w:t>
       </w:r>
     </w:p>
     <w:p>
@@ -862,7 +862,71 @@
                 <w:sz w:val="19"/>
                 <w:szCs w:val="19"/>
               </w:rPr>
-              <w:t xml:space="preserve">Manually entered by practice staff on desktop or mobile at the point a concern, SAR, stock movement or temperature reading occurs.</w:t>
+              <w:t xml:space="preserve">Manually entered by practice staff on desktop or mobile at the point a concern, SAR, significant event, stock movement or temperature reading occurs.</w:t>
+            </w:r>
+          </w:p>
+        </w:tc>
+      </w:tr>
+      <w:tr>
+        <w:trPr>
+          <w:cantSplit/>
+        </w:trPr>
+        <w:tc>
+          <w:tcPr>
+            <w:tcW w:type="dxa" w:w="2200"/>
+            <w:tcBorders>
+              <w:top w:val="single" w:color="BFB9A8" w:sz="4"/>
+              <w:left w:val="single" w:color="BFB9A8" w:sz="4"/>
+              <w:bottom w:val="single" w:color="BFB9A8" w:sz="4"/>
+              <w:right w:val="single" w:color="BFB9A8" w:sz="4"/>
+            </w:tcBorders>
+            <w:shd w:fill="F6F5F1" w:color="auto" w:val="clear"/>
+            <w:tcMar>
+              <w:top w:type="dxa" w:w="70"/>
+              <w:left w:type="dxa" w:w="110"/>
+              <w:bottom w:type="dxa" w:w="70"/>
+              <w:right w:type="dxa" w:w="110"/>
+            </w:tcMar>
+          </w:tcPr>
+          <w:p>
+            <w:pPr>
+              <w:spacing w:after="40"/>
+            </w:pPr>
+            <w:r>
+              <w:rPr>
+                <w:sz w:val="19"/>
+                <w:szCs w:val="19"/>
+              </w:rPr>
+              <w:t xml:space="preserve">Significant events (added 8 October 2026)</w:t>
+            </w:r>
+          </w:p>
+        </w:tc>
+        <w:tc>
+          <w:tcPr>
+            <w:tcW w:type="dxa" w:w="7438"/>
+            <w:tcBorders>
+              <w:top w:val="single" w:color="BFB9A8" w:sz="4"/>
+              <w:left w:val="single" w:color="BFB9A8" w:sz="4"/>
+              <w:bottom w:val="single" w:color="BFB9A8" w:sz="4"/>
+              <w:right w:val="single" w:color="BFB9A8" w:sz="4"/>
+            </w:tcBorders>
+            <w:tcMar>
+              <w:top w:type="dxa" w:w="70"/>
+              <w:left w:type="dxa" w:w="110"/>
+              <w:bottom w:type="dxa" w:w="70"/>
+              <w:right w:type="dxa" w:w="110"/>
+            </w:tcMar>
+          </w:tcPr>
+          <w:p>
+            <w:pPr>
+              <w:spacing w:after="40"/>
+            </w:pPr>
+            <w:r>
+              <w:rPr>
+                <w:sz w:val="19"/>
+                <w:szCs w:val="19"/>
+              </w:rPr>
+              <w:t xml:space="preserve">Any member of staff can report a significant event. It records what happened (in words that name no one), the date, room, kind of event, level of harm and, if a patient was involved, their EMIS number (or initials and date of birth if there is none), never a name. Staff are referred to by role; the team can link staff by account to follow or review an event. Investigation findings, each reviewer's own review, the notes of significant event meetings (who attended, what was said about each event) and agreed actions are stored. People see only events they reported, lead, are named on or were asked to review; a Significant events team and partners (oversight) see all. Reviews and notes are kept for the life of the record like Concerns; the timeline cannot be edited or deleted. Notifications carry the reference and title only.</w:t>
             </w:r>
           </w:p>
         </w:tc>
@@ -6433,6 +6497,128 @@
                 <w:sz w:val="19"/>
                 <w:szCs w:val="19"/>
               </w:rPr>
+              <w:t xml:space="preserve">NEW: a significant event report names a patient or a colleague in free text, or is seen by people who shouldn't</w:t>
+            </w:r>
+          </w:p>
+        </w:tc>
+        <w:tc>
+          <w:tcPr>
+            <w:tcW w:type="dxa" w:w="1700"/>
+            <w:tcBorders>
+              <w:top w:val="single" w:color="BFB9A8" w:sz="4"/>
+              <w:left w:val="single" w:color="BFB9A8" w:sz="4"/>
+              <w:bottom w:val="single" w:color="BFB9A8" w:sz="4"/>
+              <w:right w:val="single" w:color="BFB9A8" w:sz="4"/>
+            </w:tcBorders>
+            <w:tcMar>
+              <w:top w:type="dxa" w:w="70"/>
+              <w:left w:type="dxa" w:w="110"/>
+              <w:bottom w:type="dxa" w:w="70"/>
+              <w:right w:type="dxa" w:w="110"/>
+            </w:tcMar>
+          </w:tcPr>
+          <w:p>
+            <w:pPr>
+              <w:spacing w:after="40"/>
+            </w:pPr>
+            <w:r>
+              <w:rPr>
+                <w:sz w:val="19"/>
+                <w:szCs w:val="19"/>
+              </w:rPr>
+              <w:t xml:space="preserve">Possible</w:t>
+            </w:r>
+          </w:p>
+        </w:tc>
+        <w:tc>
+          <w:tcPr>
+            <w:tcW w:type="dxa" w:w="1738"/>
+            <w:tcBorders>
+              <w:top w:val="single" w:color="BFB9A8" w:sz="4"/>
+              <w:left w:val="single" w:color="BFB9A8" w:sz="4"/>
+              <w:bottom w:val="single" w:color="BFB9A8" w:sz="4"/>
+              <w:right w:val="single" w:color="BFB9A8" w:sz="4"/>
+            </w:tcBorders>
+            <w:tcMar>
+              <w:top w:type="dxa" w:w="70"/>
+              <w:left w:type="dxa" w:w="110"/>
+              <w:bottom w:type="dxa" w:w="70"/>
+              <w:right w:type="dxa" w:w="110"/>
+            </w:tcMar>
+          </w:tcPr>
+          <w:p>
+            <w:pPr>
+              <w:spacing w:after="40"/>
+            </w:pPr>
+            <w:r>
+              <w:rPr>
+                <w:sz w:val="19"/>
+                <w:szCs w:val="19"/>
+              </w:rPr>
+              <w:t xml:space="preserve">Significant</w:t>
+            </w:r>
+          </w:p>
+        </w:tc>
+        <w:tc>
+          <w:tcPr>
+            <w:tcW w:type="dxa" w:w="1300"/>
+            <w:tcBorders>
+              <w:top w:val="single" w:color="BFB9A8" w:sz="4"/>
+              <w:left w:val="single" w:color="BFB9A8" w:sz="4"/>
+              <w:bottom w:val="single" w:color="BFB9A8" w:sz="4"/>
+              <w:right w:val="single" w:color="BFB9A8" w:sz="4"/>
+            </w:tcBorders>
+            <w:tcMar>
+              <w:top w:type="dxa" w:w="70"/>
+              <w:left w:type="dxa" w:w="110"/>
+              <w:bottom w:type="dxa" w:w="70"/>
+              <w:right w:type="dxa" w:w="110"/>
+            </w:tcMar>
+          </w:tcPr>
+          <w:p>
+            <w:pPr>
+              <w:spacing w:after="40"/>
+            </w:pPr>
+            <w:r>
+              <w:rPr>
+                <w:sz w:val="19"/>
+                <w:szCs w:val="19"/>
+              </w:rPr>
+              <w:t xml:space="preserve">Medium</w:t>
+            </w:r>
+          </w:p>
+        </w:tc>
+      </w:tr>
+      <w:tr>
+        <w:trPr>
+          <w:cantSplit/>
+        </w:trPr>
+        <w:tc>
+          <w:tcPr>
+            <w:tcW w:type="dxa" w:w="4900"/>
+            <w:tcBorders>
+              <w:top w:val="single" w:color="BFB9A8" w:sz="4"/>
+              <w:left w:val="single" w:color="BFB9A8" w:sz="4"/>
+              <w:bottom w:val="single" w:color="BFB9A8" w:sz="4"/>
+              <w:right w:val="single" w:color="BFB9A8" w:sz="4"/>
+            </w:tcBorders>
+            <w:shd w:fill="F6F5F1" w:color="auto" w:val="clear"/>
+            <w:tcMar>
+              <w:top w:type="dxa" w:w="70"/>
+              <w:left w:type="dxa" w:w="110"/>
+              <w:bottom w:type="dxa" w:w="70"/>
+              <w:right w:type="dxa" w:w="110"/>
+            </w:tcMar>
+          </w:tcPr>
+          <w:p>
+            <w:pPr>
+              <w:spacing w:after="40"/>
+            </w:pPr>
+            <w:r>
+              <w:rPr>
+                <w:sz w:val="19"/>
+                <w:szCs w:val="19"/>
+              </w:rPr>
               <w:t xml:space="preserve">NEW: personal data sent to Azure is retained or processed outside the intended region</w:t>
             </w:r>
           </w:p>
@@ -6521,6 +6707,128 @@
                 <w:szCs w:val="19"/>
               </w:rPr>
               <w:t xml:space="preserve">Medium</w:t>
+            </w:r>
+          </w:p>
+        </w:tc>
+      </w:tr>
+      <w:tr>
+        <w:trPr>
+          <w:cantSplit/>
+        </w:trPr>
+        <w:tc>
+          <w:tcPr>
+            <w:tcW w:type="dxa" w:w="4900"/>
+            <w:tcBorders>
+              <w:top w:val="single" w:color="BFB9A8" w:sz="4"/>
+              <w:left w:val="single" w:color="BFB9A8" w:sz="4"/>
+              <w:bottom w:val="single" w:color="BFB9A8" w:sz="4"/>
+              <w:right w:val="single" w:color="BFB9A8" w:sz="4"/>
+            </w:tcBorders>
+            <w:shd w:fill="F6F5F1" w:color="auto" w:val="clear"/>
+            <w:tcMar>
+              <w:top w:type="dxa" w:w="70"/>
+              <w:left w:type="dxa" w:w="110"/>
+              <w:bottom w:type="dxa" w:w="70"/>
+              <w:right w:type="dxa" w:w="110"/>
+            </w:tcMar>
+          </w:tcPr>
+          <w:p>
+            <w:pPr>
+              <w:spacing w:after="40"/>
+            </w:pPr>
+            <w:r>
+              <w:rPr>
+                <w:sz w:val="19"/>
+                <w:szCs w:val="19"/>
+              </w:rPr>
+              <w:t xml:space="preserve">NEW: a significant event names someone, or is seen by the wrong people</w:t>
+            </w:r>
+          </w:p>
+        </w:tc>
+        <w:tc>
+          <w:tcPr>
+            <w:tcW w:type="dxa" w:w="1700"/>
+            <w:tcBorders>
+              <w:top w:val="single" w:color="BFB9A8" w:sz="4"/>
+              <w:left w:val="single" w:color="BFB9A8" w:sz="4"/>
+              <w:bottom w:val="single" w:color="BFB9A8" w:sz="4"/>
+              <w:right w:val="single" w:color="BFB9A8" w:sz="4"/>
+            </w:tcBorders>
+            <w:tcMar>
+              <w:top w:type="dxa" w:w="70"/>
+              <w:left w:type="dxa" w:w="110"/>
+              <w:bottom w:type="dxa" w:w="70"/>
+              <w:right w:type="dxa" w:w="110"/>
+            </w:tcMar>
+          </w:tcPr>
+          <w:p>
+            <w:pPr>
+              <w:spacing w:after="40"/>
+            </w:pPr>
+            <w:r>
+              <w:rPr>
+                <w:sz w:val="19"/>
+                <w:szCs w:val="19"/>
+              </w:rPr>
+              <w:t xml:space="preserve">The report form says never to use names and to refer to roles; patients are identified by EMIS number (or initials and date of birth) only. Only the reporter, the investigation lead, people named on it, reviewers asked to look at it, the Significant events team and partners (oversight) can open an event: this is enforced by the database rules and tested. Reviewers see only their own review. Notes and the history cannot be edited or deleted. Notifications carry the reference and title only.</w:t>
+            </w:r>
+          </w:p>
+        </w:tc>
+        <w:tc>
+          <w:tcPr>
+            <w:tcW w:type="dxa" w:w="1738"/>
+            <w:tcBorders>
+              <w:top w:val="single" w:color="BFB9A8" w:sz="4"/>
+              <w:left w:val="single" w:color="BFB9A8" w:sz="4"/>
+              <w:bottom w:val="single" w:color="BFB9A8" w:sz="4"/>
+              <w:right w:val="single" w:color="BFB9A8" w:sz="4"/>
+            </w:tcBorders>
+            <w:tcMar>
+              <w:top w:type="dxa" w:w="70"/>
+              <w:left w:type="dxa" w:w="110"/>
+              <w:bottom w:type="dxa" w:w="70"/>
+              <w:right w:type="dxa" w:w="110"/>
+            </w:tcMar>
+          </w:tcPr>
+          <w:p>
+            <w:pPr>
+              <w:spacing w:after="40"/>
+            </w:pPr>
+            <w:r>
+              <w:rPr>
+                <w:sz w:val="19"/>
+                <w:szCs w:val="19"/>
+              </w:rPr>
+              <w:t xml:space="preserve">Low to Medium (free text can still contain a name, so practice guidance should say not to)</w:t>
+            </w:r>
+          </w:p>
+        </w:tc>
+        <w:tc>
+          <w:tcPr>
+            <w:tcW w:type="dxa" w:w="1300"/>
+            <w:tcBorders>
+              <w:top w:val="single" w:color="BFB9A8" w:sz="4"/>
+              <w:left w:val="single" w:color="BFB9A8" w:sz="4"/>
+              <w:bottom w:val="single" w:color="BFB9A8" w:sz="4"/>
+              <w:right w:val="single" w:color="BFB9A8" w:sz="4"/>
+            </w:tcBorders>
+            <w:tcMar>
+              <w:top w:type="dxa" w:w="70"/>
+              <w:left w:type="dxa" w:w="110"/>
+              <w:bottom w:type="dxa" w:w="70"/>
+              <w:right w:type="dxa" w:w="110"/>
+            </w:tcMar>
+          </w:tcPr>
+          <w:p>
+            <w:pPr>
+              <w:spacing w:after="40"/>
+            </w:pPr>
+            <w:r>
+              <w:rPr>
+                <w:sz w:val="19"/>
+                <w:szCs w:val="19"/>
+              </w:rPr>
+              <w:t xml:space="preserve">☐</w:t>
             </w:r>
           </w:p>
         </w:tc>

</xml_diff>

<commit_message>
Orb: record stock used ('I've just taken one adrenaline from room D62'): asks the place and the batch (by the end of its number), confirm card, takes from the chosen batch
Co-Authored-By: Claude Sonnet 5.5 <noreply@anthropic.com>
</commit_message>
<xml_diff>
--- a/public/governance/dpia-draft.docx
+++ b/public/governance/dpia-draft.docx
@@ -2446,7 +2446,7 @@
         <w:spacing w:after="100" w:line="276"/>
       </w:pPr>
       <w:r>
-        <w:t xml:space="preserve">The Orb is Primovex's assistant. It answers questions about the practice (stock, fridges, cleaning, alerts and similar) from approved lookups, and can now also prepare two actions for a person to confirm: a short message to a team (everyone with a role such as HCA) and a reorder request for a stock item. Nothing is sent or created until the person presses Confirm on a card that shows exactly what will happen; the card expires after 15 minutes, can be used once, and is checked against the person's permissions again. The messages can't contain numbers, dates, email addresses or phone numbers, so patient details are refused, and each use is recorded in the audit trail. Until recently it understood only fixed phrases. Two optional AI features now use Microsoft Azure OpenAI. Both are switched off until a System Admin turns each one on, with a confirmation that the region and this DPIA have been checked. They are independent.</w:t>
+        <w:t xml:space="preserve">The Orb is Primovex's assistant. It answers questions about the practice (stock, fridges, cleaning, alerts and similar) from approved lookups, and can now also prepare four actions for a person to confirm: a short message to a team (everyone with a role such as HCA), a reorder request for a stock item, recording stock that has been used (which product, how many, from where and which batch), and reporting a significant event. Nothing is sent or created until the person presses Confirm on a card that shows exactly what will happen; the card expires after 15 minutes, can be used once, and is checked against the person's permissions again. The messages can't contain numbers, dates, email addresses or phone numbers, so patient details are refused, and each use is recorded in the audit trail. Until recently it understood only fixed phrases. Two optional AI features now use Microsoft Azure OpenAI. Both are switched off until a System Admin turns each one on, with a confirmation that the region and this DPIA have been checked. They are independent.</w:t>
       </w:r>
     </w:p>
     <w:tbl>
@@ -3253,7 +3253,7 @@
         <w:spacing w:after="60" w:line="276"/>
       </w:pPr>
       <w:r>
-        <w:t xml:space="preserve">No decision about a person is made by the AI. It only chooses a lookup or rewords an answer, and the AI never carries anything out. All lookups only read. The only changes the Orb can make are the two above (a team message, a reorder request), and only after the person presses Confirm.</w:t>
+        <w:t xml:space="preserve">No decision about a person is made by the AI. It only chooses a lookup or rewords an answer, and the AI never carries anything out. All lookups only read. The only changes the Orb can make are the four above (a team message, a reorder request, stock used, a significant event report), and only after the person presses Confirm.</w:t>
       </w:r>
     </w:p>
     <w:p>
@@ -4431,7 +4431,7 @@
                 <w:sz w:val="19"/>
                 <w:szCs w:val="19"/>
               </w:rPr>
-              <w:t xml:space="preserve">Access is capability-based, enforced at both the application and database layers. The activity report is read-only and cannot be edited by anyone. The proposed purpose limit for activity records is stated above. The AI cannot take actions. The Orb's two actions (team message, reorder request) need an explicit Confirm, the same permission as doing it by hand (stock write), and are audited.</w:t>
+              <w:t xml:space="preserve">Access is capability-based, enforced at both the application and database layers. The activity report is read-only and cannot be edited by anyone. The proposed purpose limit for activity records is stated above. The AI cannot take actions. The Orb's actions (team message, reorder request, stock used, significant event report) need an explicit Confirm, the same permission as doing it by hand, and are audited.</w:t>
             </w:r>
           </w:p>
         </w:tc>

</xml_diff>

<commit_message>
Stock review: daily check for stock nobody has touched (stock take request to whoever last handled it) and stock that looks like too much or too little for how fast it is used (weekly summary, Alerts panel)
Co-Authored-By: Claude Sonnet 5.5 <noreply@anthropic.com>
</commit_message>
<xml_diff>
--- a/public/governance/dpia-draft.docx
+++ b/public/governance/dpia-draft.docx
@@ -863,6 +863,70 @@
                 <w:szCs w:val="19"/>
               </w:rPr>
               <w:t xml:space="preserve">Manually entered by practice staff on desktop or mobile at the point a concern, SAR, significant event, stock movement or temperature reading occurs.</w:t>
+            </w:r>
+          </w:p>
+        </w:tc>
+      </w:tr>
+      <w:tr>
+        <w:trPr>
+          <w:cantSplit/>
+        </w:trPr>
+        <w:tc>
+          <w:tcPr>
+            <w:tcW w:type="dxa" w:w="2200"/>
+            <w:tcBorders>
+              <w:top w:val="single" w:color="BFB9A8" w:sz="4"/>
+              <w:left w:val="single" w:color="BFB9A8" w:sz="4"/>
+              <w:bottom w:val="single" w:color="BFB9A8" w:sz="4"/>
+              <w:right w:val="single" w:color="BFB9A8" w:sz="4"/>
+            </w:tcBorders>
+            <w:shd w:fill="F6F5F1" w:color="auto" w:val="clear"/>
+            <w:tcMar>
+              <w:top w:type="dxa" w:w="70"/>
+              <w:left w:type="dxa" w:w="110"/>
+              <w:bottom w:type="dxa" w:w="70"/>
+              <w:right w:type="dxa" w:w="110"/>
+            </w:tcMar>
+          </w:tcPr>
+          <w:p>
+            <w:pPr>
+              <w:spacing w:after="40"/>
+            </w:pPr>
+            <w:r>
+              <w:rPr>
+                <w:sz w:val="19"/>
+                <w:szCs w:val="19"/>
+              </w:rPr>
+              <w:t xml:space="preserve">Stock review (added 9 October 2026)</w:t>
+            </w:r>
+          </w:p>
+        </w:tc>
+        <w:tc>
+          <w:tcPr>
+            <w:tcW w:type="dxa" w:w="7438"/>
+            <w:tcBorders>
+              <w:top w:val="single" w:color="BFB9A8" w:sz="4"/>
+              <w:left w:val="single" w:color="BFB9A8" w:sz="4"/>
+              <w:bottom w:val="single" w:color="BFB9A8" w:sz="4"/>
+              <w:right w:val="single" w:color="BFB9A8" w:sz="4"/>
+            </w:tcBorders>
+            <w:tcMar>
+              <w:top w:type="dxa" w:w="70"/>
+              <w:left w:type="dxa" w:w="110"/>
+              <w:bottom w:type="dxa" w:w="70"/>
+              <w:right w:type="dxa" w:w="110"/>
+            </w:tcMar>
+          </w:tcPr>
+          <w:p>
+            <w:pPr>
+              <w:spacing w:after="40"/>
+            </w:pPr>
+            <w:r>
+              <w:rPr>
+                <w:sz w:val="19"/>
+                <w:szCs w:val="19"/>
+              </w:rPr>
+              <w:t xml:space="preserve">A daily check on the server reads the stock records and stock movements (which already record who used or counted an item) to find stock nobody has touched for six months, and stock that looks like too much or too little for how fast it is used. It writes a list for the Alerts page (item names, quantities and the name of the person who last handled the item) and sends a message to that person asking for a stock take, and a weekly summary to people who can verify stock. No patient data is involved. Emergency drugs, emergency equipment and kit stock are left out.</w:t>
             </w:r>
           </w:p>
         </w:tc>

</xml_diff>

<commit_message>
Staff training matrix: Primovex holds who has done which course and when it runs out
Matrix page (desktop), People, Courses and a one-off Excel import (adds only, never deletes or
replaces with an older date). Practice Manager and Management Assistants see everyone
(training.manage); a nurse manager sees and edits the clinical team on desktop and phone
(training.manageClinical); everyone sees only their own on the phone (Me > My training).
Firestore rules enforce the three scopes (attack suite section 24). Daily reminder function:
person alerted 60 days before and when overdue, weekly count with no names to the managers.
Inspection pack gets a Staff training section (counts only). Help articles; DPIA draft D4.

Co-Authored-By: Claude Sonnet 5.5 <noreply@anthropic.com>
</commit_message>
<xml_diff>
--- a/public/governance/dpia-draft.docx
+++ b/public/governance/dpia-draft.docx
@@ -3331,6 +3331,172 @@
       </w:pPr>
       <w:r>
         <w:t xml:space="preserve">Free-text risk: staff could type a patient's name into the Orb. Numbers and dates are removed automatically, but names cannot be reliably detected. Staff guidance is required (Step 6).</w:t>
+      </w:r>
+    </w:p>
+    <w:p>
+      <w:pPr>
+        <w:pStyle w:val="Heading2"/>
+        <w:keepNext/>
+        <w:spacing w:after="100" w:before="240"/>
+      </w:pPr>
+      <w:r>
+        <w:t xml:space="preserve">D2. Speaking to the Orb on an iPhone (new)</w:t>
+      </w:r>
+    </w:p>
+    <w:p>
+      <w:pPr>
+        <w:spacing w:after="100" w:line="276"/>
+      </w:pPr>
+      <w:r>
+        <w:t xml:space="preserve">On an iPhone the Home Screen web app has no speech recognition of its own. A person taps the Orb, says a question, and the recording is turned into words so the Orb can answer as if it had been typed.</w:t>
+      </w:r>
+    </w:p>
+    <w:p>
+      <w:pPr>
+        <w:pStyle w:val="ListParagraph"/>
+        <w:numPr>
+          <w:ilvl w:val="0"/>
+          <w:numId w:val="2"/>
+        </w:numPr>
+        <w:spacing w:after="60" w:line="276"/>
+      </w:pPr>
+      <w:r>
+        <w:t xml:space="preserve">What is sent: one short recording (up to 20 seconds, 16 kHz, no more than a sentence or two) from the person's phone to a Primovex Cloud Function, and from there to Google Cloud Speech-to-Text through its EU endpoint. Optional hints are the practice's own stock names.</w:t>
+      </w:r>
+    </w:p>
+    <w:p>
+      <w:pPr>
+        <w:pStyle w:val="ListParagraph"/>
+        <w:numPr>
+          <w:ilvl w:val="0"/>
+          <w:numId w:val="2"/>
+        </w:numPr>
+        <w:spacing w:after="60" w:line="276"/>
+      </w:pPr>
+      <w:r>
+        <w:t xml:space="preserve">What is kept: nothing. The recording is held in memory for that one request and is not stored by Primovex or written to any log. The words that come back are used exactly like typed text and are not stored by the speech step.</w:t>
+      </w:r>
+    </w:p>
+    <w:p>
+      <w:pPr>
+        <w:pStyle w:val="ListParagraph"/>
+        <w:numPr>
+          <w:ilvl w:val="0"/>
+          <w:numId w:val="2"/>
+        </w:numPr>
+        <w:spacing w:after="60" w:line="276"/>
+      </w:pPr>
+      <w:r>
+        <w:t xml:space="preserve">Processor: Google Cloud (the same project and data processing addendum as Firebase). Processing is in the EU, not specifically the UK. </w:t>
+      </w:r>
+      <w:r>
+        <w:rPr>
+          <w:b/>
+          <w:bCs/>
+          <w:i/>
+          <w:iCs/>
+          <w:color w:val="96631A"/>
+        </w:rPr>
+        <w:t xml:space="preserve">To be completed</w:t>
+      </w:r>
+      <w:r>
+        <w:t xml:space="preserve">: confirm this is acceptable under the UK-only hosting decision, and confirm Google's retention terms for Speech-to-Text requests that do not opt in to data logging.</w:t>
+      </w:r>
+    </w:p>
+    <w:p>
+      <w:pPr>
+        <w:pStyle w:val="ListParagraph"/>
+        <w:numPr>
+          <w:ilvl w:val="0"/>
+          <w:numId w:val="2"/>
+        </w:numPr>
+        <w:spacing w:after="60" w:line="276"/>
+      </w:pPr>
+      <w:r>
+        <w:t xml:space="preserve">Risk: staff could say a patient's name aloud. The same notice and guidance as for typing applies (Step 6): do not say patient names; use EMIS numbers only. Spoken numbers are not removed by the speech step.</w:t>
+      </w:r>
+    </w:p>
+    <w:p>
+      <w:pPr>
+        <w:pStyle w:val="ListParagraph"/>
+        <w:numPr>
+          <w:ilvl w:val="0"/>
+          <w:numId w:val="2"/>
+        </w:numPr>
+        <w:spacing w:after="60" w:line="276"/>
+      </w:pPr>
+      <w:r>
+        <w:t xml:space="preserve">Limits: 60 per person per hour and 400 per day for the practice. Only signed-in people can use it.</w:t>
+      </w:r>
+    </w:p>
+    <w:p>
+      <w:pPr>
+        <w:pStyle w:val="Heading2"/>
+        <w:keepNext/>
+        <w:spacing w:after="100" w:before="240"/>
+      </w:pPr>
+      <w:r>
+        <w:t xml:space="preserve">D3. Alerts on staff phones (new)</w:t>
+      </w:r>
+    </w:p>
+    <w:p>
+      <w:pPr>
+        <w:spacing w:after="100" w:line="276"/>
+      </w:pPr>
+      <w:r>
+        <w:t xml:space="preserve">Primovex can show an alert on a person's phone lock screen when something new arrives in their notifications. A person switches this on themselves, on each phone, in Me then Phone alerts.</w:t>
+      </w:r>
+    </w:p>
+    <w:p>
+      <w:pPr>
+        <w:pStyle w:val="ListParagraph"/>
+        <w:numPr>
+          <w:ilvl w:val="0"/>
+          <w:numId w:val="2"/>
+        </w:numPr>
+        <w:spacing w:after="60" w:line="276"/>
+      </w:pPr>
+      <w:r>
+        <w:t xml:space="preserve">What is kept: a push address for each phone the person switched alerts on for, under their own account (readable only by Primovex's server, not by any person or the app). It is deleted when the person switches alerts off or when the phone no longer accepts alerts.</w:t>
+      </w:r>
+    </w:p>
+    <w:p>
+      <w:pPr>
+        <w:pStyle w:val="ListParagraph"/>
+        <w:numPr>
+          <w:ilvl w:val="0"/>
+          <w:numId w:val="2"/>
+        </w:numPr>
+        <w:spacing w:after="60" w:line="276"/>
+      </w:pPr>
+      <w:r>
+        <w:t xml:space="preserve">What a lock screen can show: the title and a short line for an operational alert (a fridge out of range, a failed check); who a message is from, never its words; and for anything about governance (SARs, concerns, significant events) only the words You have a new notification. No patient details are ever put in an alert.</w:t>
+      </w:r>
+    </w:p>
+    <w:p>
+      <w:pPr>
+        <w:pStyle w:val="ListParagraph"/>
+        <w:numPr>
+          <w:ilvl w:val="0"/>
+          <w:numId w:val="2"/>
+        </w:numPr>
+        <w:spacing w:after="60" w:line="276"/>
+      </w:pPr>
+      <w:r>
+        <w:t xml:space="preserve">Processor: Google Cloud (Firebase Cloud Messaging) and the phone maker's push service (Apple or Google) carry the alert to the phone. </w:t>
+      </w:r>
+      <w:r>
+        <w:rPr>
+          <w:b/>
+          <w:bCs/>
+          <w:i/>
+          <w:iCs/>
+          <w:color w:val="96631A"/>
+        </w:rPr>
+        <w:t xml:space="preserve">To be completed</w:t>
+      </w:r>
+      <w:r>
+        <w:t xml:space="preserve">: confirm these are covered by the review of Google's data processing addendum, and note that Apple's push service is a further processor for iPhones.</w:t>
       </w:r>
     </w:p>
     <w:p>

</xml_diff>